<commit_message>
Journalname aus PubMed statt aus der Modellantwort
Autor, Publikationsdatum und Aufnahmedatum kamen schon immer aus esummary,
der Journalname aber aus der Antwort des Sprachmodells. Im Abstract-Block
steht er nur in der Kopfzeile - das Modell ergaenzt dort bereitwillig, was
haeufig vorkommt.

Aufgefallen im Schwesterportal ki.m-vf.de: aus NPJ Prim Care Respir Med
wurde Nat Commun. Hier stand derselbe Fehler im Bestand.

fetch_meta() liefert jetzt journal und year mit; der Prompt weist das Modell
an, nichts zu raten. Der vorhandene Bestand ist gegen esummary abgeglichen.
</commit_message>
<xml_diff>
--- a/download/studien-aktuell.docx
+++ b/download/studien-aktuell.docx
@@ -204,7 +204,7 @@
           <w:color w:val="666666"/>
           <w:sz w:val="18"/>
         </w:rPr>
-        <w:t>Caldwell JM et al.  ·  PLoS One  ·  14.08.2026  ·  PMID 42600025</w:t>
+        <w:t>Caldwell JM et al.  ·  Sci Adv  ·  14.08.2026  ·  PMID 42600025</w:t>
       </w:r>
     </w:p>
     <w:p>
@@ -494,7 +494,7 @@
           <w:color w:val="666666"/>
           <w:sz w:val="18"/>
         </w:rPr>
-        <w:t>Radici A et al.  ·  Global Change Biology  ·  Aug. 2026  ·  PMID 42572830</w:t>
+        <w:t>Radici A et al.  ·  Glob Chang Biol  ·  Aug. 2026  ·  PMID 42572830</w:t>
       </w:r>
     </w:p>
     <w:p>

</xml_diff>